<commit_message>
Clean up: Remove unnecessary files and modify files
</commit_message>
<xml_diff>
--- a/BIT4107 Mobile Application Development Logbook.docx
+++ b/BIT4107 Mobile Application Development Logbook.docx
@@ -122,6 +122,12 @@
     </w:p>
     <w:sdt>
       <w:sdtPr>
+        <w:rPr>
+          <w:rFonts w:ascii="Cambria" w:eastAsia="MS Mincho" w:hAnsi="Cambria" w:cs="SimSun"/>
+          <w:color w:val="auto"/>
+          <w:sz w:val="22"/>
+          <w:szCs w:val="22"/>
+        </w:rPr>
         <w:id w:val="1783605180"/>
         <w:docPartObj>
           <w:docPartGallery w:val="Table of Contents"/>
@@ -130,13 +136,9 @@
       </w:sdtPr>
       <w:sdtEndPr>
         <w:rPr>
-          <w:rFonts w:ascii="Cambria" w:eastAsia="MS Mincho" w:hAnsi="Cambria" w:cs="SimSun"/>
           <w:b/>
           <w:bCs/>
           <w:noProof/>
-          <w:color w:val="auto"/>
-          <w:sz w:val="22"/>
-          <w:szCs w:val="22"/>
         </w:rPr>
       </w:sdtEndPr>
       <w:sdtContent>
@@ -782,8 +784,6 @@
         </w:rPr>
         <w:br w:type="page"/>
       </w:r>
-      <w:bookmarkStart w:id="1" w:name="_GoBack"/>
-      <w:bookmarkEnd w:id="1"/>
     </w:p>
     <w:p>
       <w:pPr>
@@ -793,7 +793,7 @@
           <w:bCs/>
         </w:rPr>
       </w:pPr>
-      <w:bookmarkStart w:id="2" w:name="_Toc232519873"/>
+      <w:bookmarkStart w:id="1" w:name="_Toc232519873"/>
       <w:r>
         <w:rPr>
           <w:b/>
@@ -802,7 +802,7 @@
         <w:lastRenderedPageBreak/>
         <w:t>Week 1: Introduction to Mobile Application Development</w:t>
       </w:r>
-      <w:bookmarkEnd w:id="2"/>
+      <w:bookmarkEnd w:id="1"/>
     </w:p>
     <w:p>
       <w:pPr>
@@ -836,6 +836,9 @@
     </w:p>
     <w:p>
       <w:r>
+        <w:rPr>
+          <w:noProof/>
+        </w:rPr>
         <w:drawing>
           <wp:inline distT="0" distB="0" distL="0" distR="0" wp14:anchorId="53F1146B" wp14:editId="4DCA5C29">
             <wp:extent cx="5943600" cy="2367280"/>
@@ -881,10 +884,10 @@
           <w:szCs w:val="22"/>
         </w:rPr>
       </w:pPr>
-      <w:bookmarkStart w:id="3" w:name="_Toc232519926"/>
-      <w:bookmarkStart w:id="4" w:name="_Toc232519981"/>
-      <w:bookmarkStart w:id="5" w:name="_Toc232521176"/>
-      <w:bookmarkStart w:id="6" w:name="_Toc232521214"/>
+      <w:bookmarkStart w:id="2" w:name="_Toc232519926"/>
+      <w:bookmarkStart w:id="3" w:name="_Toc232519981"/>
+      <w:bookmarkStart w:id="4" w:name="_Toc232521176"/>
+      <w:bookmarkStart w:id="5" w:name="_Toc232521214"/>
       <w:r>
         <w:rPr>
           <w:sz w:val="22"/>
@@ -935,10 +938,10 @@
         </w:rPr>
         <w:t>.1: Creating a new Expo project using npx create-expo-app</w:t>
       </w:r>
+      <w:bookmarkEnd w:id="2"/>
       <w:bookmarkEnd w:id="3"/>
       <w:bookmarkEnd w:id="4"/>
       <w:bookmarkEnd w:id="5"/>
-      <w:bookmarkEnd w:id="6"/>
     </w:p>
     <w:p>
       <w:pPr>
@@ -999,14 +1002,7 @@
           <w:sz w:val="22"/>
           <w:szCs w:val="22"/>
         </w:rPr>
-        <w:t xml:space="preserve">Figure </w:t>
-      </w:r>
-      <w:r>
-        <w:rPr>
-          <w:sz w:val="22"/>
-          <w:szCs w:val="22"/>
-        </w:rPr>
-        <w:t>1.2: Initial project structure in VS Code</w:t>
+        <w:t>Figure 1.2: Initial project structure in VS Code</w:t>
       </w:r>
     </w:p>
     <w:p>
@@ -1082,14 +1078,7 @@
           <w:szCs w:val="22"/>
         </w:rPr>
         <w:lastRenderedPageBreak/>
-        <w:t xml:space="preserve">Figure </w:t>
-      </w:r>
-      <w:r>
-        <w:rPr>
-          <w:sz w:val="22"/>
-          <w:szCs w:val="22"/>
-        </w:rPr>
-        <w:t>1.3: App running successfully on Expo Go mobile app</w:t>
+        <w:t>Figure 1.3: App running successfully on Expo Go mobile app</w:t>
       </w:r>
     </w:p>
     <w:p>
@@ -1257,7 +1246,7 @@
           <w:bCs/>
         </w:rPr>
       </w:pPr>
-      <w:bookmarkStart w:id="7" w:name="_Toc232519874"/>
+      <w:bookmarkStart w:id="6" w:name="_Toc232519874"/>
       <w:r>
         <w:rPr>
           <w:b/>
@@ -1266,7 +1255,7 @@
         <w:lastRenderedPageBreak/>
         <w:t>Week 2: Mobile Development Environment</w:t>
       </w:r>
-      <w:bookmarkEnd w:id="7"/>
+      <w:bookmarkEnd w:id="6"/>
     </w:p>
     <w:p>
       <w:pPr>
@@ -1358,14 +1347,7 @@
           <w:sz w:val="22"/>
           <w:szCs w:val="22"/>
         </w:rPr>
-        <w:t xml:space="preserve">Figure </w:t>
-      </w:r>
-      <w:r>
-        <w:rPr>
-          <w:sz w:val="22"/>
-          <w:szCs w:val="22"/>
-        </w:rPr>
-        <w:t>2.1: VS Code with React Native extension installed</w:t>
+        <w:t>Figure 2.1: VS Code with React Native extension installed</w:t>
       </w:r>
     </w:p>
     <w:p>
@@ -1373,6 +1355,9 @@
         <w:keepNext/>
       </w:pPr>
       <w:r>
+        <w:rPr>
+          <w:noProof/>
+        </w:rPr>
         <w:drawing>
           <wp:inline distT="0" distB="0" distL="0" distR="0" wp14:anchorId="1C8691A4" wp14:editId="45E03EE1">
             <wp:extent cx="5943600" cy="2652395"/>
@@ -1425,14 +1410,7 @@
           <w:sz w:val="22"/>
           <w:szCs w:val="22"/>
         </w:rPr>
-        <w:t xml:space="preserve">Figure </w:t>
-      </w:r>
-      <w:r>
-        <w:rPr>
-          <w:sz w:val="22"/>
-          <w:szCs w:val="22"/>
-        </w:rPr>
-        <w:t>2.2: Running npx expo start and metro bundler output</w:t>
+        <w:t>Figure 2.2: Running npx expo start and metro bundler output</w:t>
       </w:r>
     </w:p>
     <w:p>
@@ -1499,14 +1477,7 @@
           <w:sz w:val="22"/>
           <w:szCs w:val="22"/>
         </w:rPr>
-        <w:t xml:space="preserve">Figure </w:t>
-      </w:r>
-      <w:r>
-        <w:rPr>
-          <w:sz w:val="22"/>
-          <w:szCs w:val="22"/>
-        </w:rPr>
-        <w:t>2.3: Debugging configuration in VS Code</w:t>
+        <w:t>Figure 2.3: Debugging configuration in VS Code</w:t>
       </w:r>
     </w:p>
     <w:p>
@@ -1699,7 +1670,7 @@
           <w:bCs/>
         </w:rPr>
       </w:pPr>
-      <w:bookmarkStart w:id="8" w:name="_Toc232519875"/>
+      <w:bookmarkStart w:id="7" w:name="_Toc232519875"/>
       <w:r>
         <w:rPr>
           <w:b/>
@@ -1707,7 +1678,7 @@
         </w:rPr>
         <w:t>Week 3: User Interface Design</w:t>
       </w:r>
-      <w:bookmarkEnd w:id="8"/>
+      <w:bookmarkEnd w:id="7"/>
     </w:p>
     <w:p>
       <w:pPr>
@@ -1812,14 +1783,7 @@
           <w:szCs w:val="22"/>
         </w:rPr>
         <w:lastRenderedPageBreak/>
-        <w:t xml:space="preserve">Figure </w:t>
-      </w:r>
-      <w:r>
-        <w:rPr>
-          <w:sz w:val="22"/>
-          <w:szCs w:val="22"/>
-        </w:rPr>
-        <w:t>3.1: Home screen with bus listings and destination filters</w:t>
+        <w:t>Figure 3.1: Home screen with bus listings and destination filters</w:t>
       </w:r>
     </w:p>
     <w:p>
@@ -1895,14 +1859,7 @@
           <w:szCs w:val="22"/>
         </w:rPr>
         <w:lastRenderedPageBreak/>
-        <w:t xml:space="preserve">Figure </w:t>
-      </w:r>
-      <w:r>
-        <w:rPr>
-          <w:sz w:val="22"/>
-          <w:szCs w:val="22"/>
-        </w:rPr>
-        <w:t>3.2: BusCard component showing trip details</w:t>
+        <w:t>Figure 3.2: BusCard component showing trip details</w:t>
       </w:r>
     </w:p>
     <w:p>
@@ -2136,7 +2093,7 @@
           <w:bCs/>
         </w:rPr>
       </w:pPr>
-      <w:bookmarkStart w:id="9" w:name="_Toc232519876"/>
+      <w:bookmarkStart w:id="8" w:name="_Toc232519876"/>
       <w:r>
         <w:rPr>
           <w:b/>
@@ -2145,7 +2102,7 @@
         <w:lastRenderedPageBreak/>
         <w:t>Week 4: Event Handling and User Interaction</w:t>
       </w:r>
-      <w:bookmarkEnd w:id="9"/>
+      <w:bookmarkEnd w:id="8"/>
     </w:p>
     <w:p>
       <w:pPr>
@@ -2182,6 +2139,9 @@
         <w:keepNext/>
       </w:pPr>
       <w:r>
+        <w:rPr>
+          <w:noProof/>
+        </w:rPr>
         <w:drawing>
           <wp:inline distT="0" distB="0" distL="0" distR="0" wp14:anchorId="55D122D4" wp14:editId="18F94AAA">
             <wp:extent cx="5943600" cy="4664710"/>
@@ -2232,21 +2192,7 @@
           <w:sz w:val="22"/>
           <w:szCs w:val="22"/>
         </w:rPr>
-        <w:t xml:space="preserve">Figure </w:t>
-      </w:r>
-      <w:r>
-        <w:rPr>
-          <w:sz w:val="22"/>
-          <w:szCs w:val="22"/>
-        </w:rPr>
-        <w:t>4.1: Handling trip selection and navigation to booking screen</w:t>
-      </w:r>
-      <w:r>
-        <w:rPr>
-          <w:sz w:val="22"/>
-          <w:szCs w:val="22"/>
-        </w:rPr>
-        <w:t xml:space="preserve"> </w:t>
+        <w:t xml:space="preserve">Figure 4.1: Handling trip selection and navigation to booking screen </w:t>
       </w:r>
     </w:p>
     <w:p>
@@ -2254,6 +2200,9 @@
         <w:keepNext/>
       </w:pPr>
       <w:r>
+        <w:rPr>
+          <w:noProof/>
+        </w:rPr>
         <w:lastRenderedPageBreak/>
         <w:drawing>
           <wp:inline distT="0" distB="0" distL="0" distR="0" wp14:anchorId="2CD1731C" wp14:editId="7A39C2F9">
@@ -2305,14 +2254,7 @@
           <w:sz w:val="22"/>
           <w:szCs w:val="22"/>
         </w:rPr>
-        <w:t xml:space="preserve">Figure </w:t>
-      </w:r>
-      <w:r>
-        <w:rPr>
-          <w:sz w:val="22"/>
-          <w:szCs w:val="22"/>
-        </w:rPr>
-        <w:t>4.2:Seat Selection</w:t>
+        <w:t>Figure 4.2:Seat Selection</w:t>
       </w:r>
     </w:p>
     <w:p>
@@ -2388,14 +2330,7 @@
           <w:szCs w:val="22"/>
         </w:rPr>
         <w:lastRenderedPageBreak/>
-        <w:t xml:space="preserve">Figure </w:t>
-      </w:r>
-      <w:r>
-        <w:rPr>
-          <w:sz w:val="22"/>
-          <w:szCs w:val="22"/>
-        </w:rPr>
-        <w:t>4.3: Passenger details form with validation</w:t>
+        <w:t>Figure 4.3: Passenger details form with validation</w:t>
       </w:r>
     </w:p>
     <w:p>
@@ -2606,6 +2541,9 @@
         <w:keepNext/>
       </w:pPr>
       <w:r>
+        <w:rPr>
+          <w:noProof/>
+        </w:rPr>
         <w:drawing>
           <wp:inline distT="0" distB="0" distL="0" distR="0" wp14:anchorId="0B8528B4" wp14:editId="0E772BA7">
             <wp:extent cx="5896798" cy="1409897"/>
@@ -2656,14 +2594,7 @@
           <w:sz w:val="22"/>
           <w:szCs w:val="22"/>
         </w:rPr>
-        <w:t xml:space="preserve">Figure </w:t>
-      </w:r>
-      <w:r>
-        <w:rPr>
-          <w:sz w:val="22"/>
-          <w:szCs w:val="22"/>
-        </w:rPr>
-        <w:t>5.1: AsyncStorage implementation for persistent data</w:t>
+        <w:t>Figure 5.1: AsyncStorage implementation for persistent data</w:t>
       </w:r>
     </w:p>
     <w:p>
@@ -2674,6 +2605,7 @@
         <w:rPr>
           <w:i/>
           <w:iCs/>
+          <w:noProof/>
         </w:rPr>
         <w:drawing>
           <wp:inline distT="0" distB="0" distL="0" distR="0" wp14:anchorId="15CB5A24" wp14:editId="2CC596AE">
@@ -2725,21 +2657,7 @@
           <w:sz w:val="22"/>
           <w:szCs w:val="22"/>
         </w:rPr>
-        <w:t xml:space="preserve">Figure </w:t>
-      </w:r>
-      <w:r>
-        <w:rPr>
-          <w:sz w:val="22"/>
-          <w:szCs w:val="22"/>
-        </w:rPr>
-        <w:t>5.2: Retrieving and displaying saved bookings</w:t>
-      </w:r>
-      <w:r>
-        <w:rPr>
-          <w:sz w:val="22"/>
-          <w:szCs w:val="22"/>
-        </w:rPr>
-        <w:t xml:space="preserve"> </w:t>
+        <w:t xml:space="preserve">Figure 5.2: Retrieving and displaying saved bookings </w:t>
       </w:r>
     </w:p>
     <w:p>
@@ -2876,7 +2794,7 @@
           <w:bCs/>
         </w:rPr>
       </w:pPr>
-      <w:bookmarkStart w:id="10" w:name="_Toc232519877"/>
+      <w:bookmarkStart w:id="9" w:name="_Toc232519877"/>
       <w:r>
         <w:rPr>
           <w:b/>
@@ -2885,7 +2803,7 @@
         <w:lastRenderedPageBreak/>
         <w:t>Week 6: Networking and APIs</w:t>
       </w:r>
-      <w:bookmarkEnd w:id="10"/>
+      <w:bookmarkEnd w:id="9"/>
     </w:p>
     <w:p>
       <w:pPr>
@@ -2916,6 +2834,9 @@
         <w:keepNext/>
       </w:pPr>
       <w:r>
+        <w:rPr>
+          <w:noProof/>
+        </w:rPr>
         <w:drawing>
           <wp:inline distT="0" distB="0" distL="0" distR="0" wp14:anchorId="0F32E508" wp14:editId="51E7FA0B">
             <wp:extent cx="5943600" cy="2156460"/>
@@ -2966,14 +2887,7 @@
           <w:sz w:val="22"/>
           <w:szCs w:val="22"/>
         </w:rPr>
-        <w:t xml:space="preserve">Figure </w:t>
-      </w:r>
-      <w:r>
-        <w:rPr>
-          <w:sz w:val="22"/>
-          <w:szCs w:val="22"/>
-        </w:rPr>
-        <w:t>6.1: Mock API response showing trip data</w:t>
+        <w:t>Figure 6.1: Mock API response showing trip data</w:t>
       </w:r>
     </w:p>
     <w:p>
@@ -2986,10 +2900,10 @@
         </w:rPr>
         <w:lastRenderedPageBreak/>
         <w:drawing>
-          <wp:inline distT="0" distB="0" distL="0" distR="0" wp14:anchorId="39487F9C" wp14:editId="7EE7E500">
+          <wp:inline distT="0" distB="0" distL="0" distR="0" wp14:anchorId="361B048A" wp14:editId="0A253E88">
             <wp:extent cx="3915410" cy="8229600"/>
             <wp:effectExtent l="0" t="0" r="8890" b="0"/>
-            <wp:docPr id="20" name="Picture 20"/>
+            <wp:docPr id="7" name="Picture 7"/>
             <wp:cNvGraphicFramePr>
               <a:graphicFrameLocks xmlns:a="http://schemas.openxmlformats.org/drawingml/2006/main" noChangeAspect="1"/>
             </wp:cNvGraphicFramePr>
@@ -3034,6 +2948,8 @@
           </wp:inline>
         </w:drawing>
       </w:r>
+      <w:bookmarkStart w:id="10" w:name="_GoBack"/>
+      <w:bookmarkEnd w:id="10"/>
     </w:p>
     <w:p>
       <w:pPr>
@@ -3049,21 +2965,7 @@
           <w:szCs w:val="22"/>
         </w:rPr>
         <w:lastRenderedPageBreak/>
-        <w:t xml:space="preserve">Figure </w:t>
-      </w:r>
-      <w:r>
-        <w:rPr>
-          <w:sz w:val="22"/>
-          <w:szCs w:val="22"/>
-        </w:rPr>
-        <w:t>6.2: Error handling</w:t>
-      </w:r>
-      <w:r>
-        <w:rPr>
-          <w:sz w:val="22"/>
-          <w:szCs w:val="22"/>
-        </w:rPr>
-        <w:t xml:space="preserve"> </w:t>
+        <w:t xml:space="preserve">Figure 6.2: Error handling </w:t>
       </w:r>
     </w:p>
     <w:p>
@@ -3333,6 +3235,9 @@
         <w:keepNext/>
       </w:pPr>
       <w:r>
+        <w:rPr>
+          <w:noProof/>
+        </w:rPr>
         <w:drawing>
           <wp:inline distT="0" distB="0" distL="0" distR="0" wp14:anchorId="7409CD47" wp14:editId="37150C5D">
             <wp:extent cx="3715268" cy="5468113"/>
@@ -3383,14 +3288,7 @@
           <w:sz w:val="22"/>
           <w:szCs w:val="22"/>
         </w:rPr>
-        <w:t xml:space="preserve">Figure </w:t>
-      </w:r>
-      <w:r>
-        <w:rPr>
-          <w:sz w:val="22"/>
-          <w:szCs w:val="22"/>
-        </w:rPr>
-        <w:t>7.1: Organized project structure following separation of concerns</w:t>
+        <w:t>Figure 7.1: Organized project structure following separation of concerns</w:t>
       </w:r>
     </w:p>
     <w:p>
@@ -3398,6 +3296,9 @@
         <w:keepNext/>
       </w:pPr>
       <w:r>
+        <w:rPr>
+          <w:noProof/>
+        </w:rPr>
         <w:lastRenderedPageBreak/>
         <w:drawing>
           <wp:inline distT="0" distB="0" distL="0" distR="0" wp14:anchorId="173C6CC9" wp14:editId="042612D8">
@@ -3449,14 +3350,7 @@
           <w:sz w:val="22"/>
           <w:szCs w:val="22"/>
         </w:rPr>
-        <w:t xml:space="preserve">Figure </w:t>
-      </w:r>
-      <w:r>
-        <w:rPr>
-          <w:sz w:val="22"/>
-          <w:szCs w:val="22"/>
-        </w:rPr>
-        <w:t>7.2: Typesript interfaces defining data models</w:t>
+        <w:t>Figure 7.2: Typesript interfaces defining data models</w:t>
       </w:r>
     </w:p>
     <w:p>
@@ -3464,6 +3358,9 @@
         <w:keepNext/>
       </w:pPr>
       <w:r>
+        <w:rPr>
+          <w:noProof/>
+        </w:rPr>
         <w:drawing>
           <wp:inline distT="0" distB="0" distL="0" distR="0" wp14:anchorId="59C6AEF4" wp14:editId="3632A846">
             <wp:extent cx="5782482" cy="1533739"/>
@@ -3514,14 +3411,7 @@
           <w:sz w:val="22"/>
           <w:szCs w:val="22"/>
         </w:rPr>
-        <w:t xml:space="preserve">Figure </w:t>
-      </w:r>
-      <w:r>
-        <w:rPr>
-          <w:sz w:val="22"/>
-          <w:szCs w:val="22"/>
-        </w:rPr>
-        <w:t>7.3: Component architecture and reusability pattern</w:t>
+        <w:t>Figure 7.3: Component architecture and reusability pattern</w:t>
       </w:r>
     </w:p>
     <w:p>
@@ -3813,357 +3703,9 @@
         </w:rPr>
       </w:pPr>
     </w:p>
-    <w:p>
-      <w:pPr>
-        <w:rPr>
-          <w:b/>
-          <w:bCs/>
-        </w:rPr>
-      </w:pPr>
-    </w:p>
-    <w:p>
-      <w:pPr>
-        <w:pStyle w:val="Heading2"/>
-        <w:rPr>
-          <w:b/>
-          <w:bCs/>
-        </w:rPr>
-      </w:pPr>
-      <w:bookmarkStart w:id="12" w:name="_Toc232519879"/>
-      <w:r>
-        <w:rPr>
-          <w:b/>
-          <w:bCs/>
-        </w:rPr>
-        <w:lastRenderedPageBreak/>
-        <w:t>Week 8: Project Planning</w:t>
-      </w:r>
-      <w:bookmarkEnd w:id="12"/>
-    </w:p>
-    <w:p>
-      <w:pPr>
-        <w:rPr>
-          <w:b/>
-          <w:bCs/>
-        </w:rPr>
-      </w:pPr>
-      <w:r>
-        <w:rPr>
-          <w:b/>
-          <w:bCs/>
-        </w:rPr>
-        <w:t>Practical Activities Undertaken</w:t>
-      </w:r>
-    </w:p>
-    <w:p>
-      <w:pPr>
-        <w:rPr>
-          <w:b/>
-          <w:bCs/>
-        </w:rPr>
-      </w:pPr>
-      <w:r>
-        <w:rPr>
-          <w:b/>
-          <w:bCs/>
-        </w:rPr>
-        <w:t>Screenshots:</w:t>
-      </w:r>
-    </w:p>
-    <w:p>
-      <w:pPr>
-        <w:keepNext/>
-      </w:pPr>
-      <w:r>
-        <w:rPr>
-          <w:noProof/>
-        </w:rPr>
-        <w:drawing>
-          <wp:inline distT="0" distB="0" distL="0" distR="0" wp14:anchorId="265D3E77" wp14:editId="4ABCC173">
-            <wp:extent cx="5943600" cy="3681730"/>
-            <wp:effectExtent l="0" t="0" r="0" b="0"/>
-            <wp:docPr id="5" name="Picture 5"/>
-            <wp:cNvGraphicFramePr>
-              <a:graphicFrameLocks xmlns:a="http://schemas.openxmlformats.org/drawingml/2006/main" noChangeAspect="1"/>
-            </wp:cNvGraphicFramePr>
-            <a:graphic xmlns:a="http://schemas.openxmlformats.org/drawingml/2006/main">
-              <a:graphicData uri="http://schemas.openxmlformats.org/drawingml/2006/picture">
-                <pic:pic xmlns:pic="http://schemas.openxmlformats.org/drawingml/2006/picture">
-                  <pic:nvPicPr>
-                    <pic:cNvPr id="1" name=""/>
-                    <pic:cNvPicPr/>
-                  </pic:nvPicPr>
-                  <pic:blipFill>
-                    <a:blip r:embed="rId26"/>
-                    <a:stretch>
-                      <a:fillRect/>
-                    </a:stretch>
-                  </pic:blipFill>
-                  <pic:spPr>
-                    <a:xfrm>
-                      <a:off x="0" y="0"/>
-                      <a:ext cx="5943600" cy="3681730"/>
-                    </a:xfrm>
-                    <a:prstGeom prst="rect">
-                      <a:avLst/>
-                    </a:prstGeom>
-                  </pic:spPr>
-                </pic:pic>
-              </a:graphicData>
-            </a:graphic>
-          </wp:inline>
-        </w:drawing>
-      </w:r>
-    </w:p>
-    <w:p>
-      <w:pPr>
-        <w:pStyle w:val="Caption"/>
-        <w:rPr>
-          <w:sz w:val="22"/>
-          <w:szCs w:val="22"/>
-        </w:rPr>
-      </w:pPr>
-      <w:r>
-        <w:rPr>
-          <w:sz w:val="22"/>
-          <w:szCs w:val="22"/>
-        </w:rPr>
-        <w:t xml:space="preserve">Figure </w:t>
-      </w:r>
-      <w:r>
-        <w:rPr>
-          <w:sz w:val="22"/>
-          <w:szCs w:val="22"/>
-        </w:rPr>
-        <w:t>8.1: Project timeline and development milestones</w:t>
-      </w:r>
-      <w:r>
-        <w:rPr>
-          <w:sz w:val="22"/>
-          <w:szCs w:val="22"/>
-        </w:rPr>
-        <w:t xml:space="preserve"> </w:t>
-      </w:r>
-    </w:p>
-    <w:p>
-      <w:pPr>
-        <w:keepNext/>
-      </w:pPr>
-      <w:r>
-        <w:rPr>
-          <w:i/>
-          <w:iCs/>
-          <w:noProof/>
-        </w:rPr>
-        <w:lastRenderedPageBreak/>
-        <w:drawing>
-          <wp:inline distT="0" distB="0" distL="0" distR="0" wp14:anchorId="504E9994" wp14:editId="72AFE88F">
-            <wp:extent cx="5943600" cy="3856990"/>
-            <wp:effectExtent l="0" t="0" r="0" b="0"/>
-            <wp:docPr id="6" name="Picture 6"/>
-            <wp:cNvGraphicFramePr>
-              <a:graphicFrameLocks xmlns:a="http://schemas.openxmlformats.org/drawingml/2006/main" noChangeAspect="1"/>
-            </wp:cNvGraphicFramePr>
-            <a:graphic xmlns:a="http://schemas.openxmlformats.org/drawingml/2006/main">
-              <a:graphicData uri="http://schemas.openxmlformats.org/drawingml/2006/picture">
-                <pic:pic xmlns:pic="http://schemas.openxmlformats.org/drawingml/2006/picture">
-                  <pic:nvPicPr>
-                    <pic:cNvPr id="1" name=""/>
-                    <pic:cNvPicPr/>
-                  </pic:nvPicPr>
-                  <pic:blipFill>
-                    <a:blip r:embed="rId27"/>
-                    <a:stretch>
-                      <a:fillRect/>
-                    </a:stretch>
-                  </pic:blipFill>
-                  <pic:spPr>
-                    <a:xfrm>
-                      <a:off x="0" y="0"/>
-                      <a:ext cx="5943600" cy="3856990"/>
-                    </a:xfrm>
-                    <a:prstGeom prst="rect">
-                      <a:avLst/>
-                    </a:prstGeom>
-                  </pic:spPr>
-                </pic:pic>
-              </a:graphicData>
-            </a:graphic>
-          </wp:inline>
-        </w:drawing>
-      </w:r>
-    </w:p>
-    <w:p>
-      <w:pPr>
-        <w:pStyle w:val="Caption"/>
-        <w:rPr>
-          <w:i w:val="0"/>
-          <w:iCs w:val="0"/>
-          <w:sz w:val="22"/>
-          <w:szCs w:val="22"/>
-        </w:rPr>
-      </w:pPr>
-      <w:r>
-        <w:rPr>
-          <w:sz w:val="22"/>
-          <w:szCs w:val="22"/>
-        </w:rPr>
-        <w:t xml:space="preserve">Figure </w:t>
-      </w:r>
-      <w:r>
-        <w:rPr>
-          <w:sz w:val="22"/>
-          <w:szCs w:val="22"/>
-        </w:rPr>
-        <w:t>8.2: Functional requirements specification for the bus booking app</w:t>
-      </w:r>
-    </w:p>
-    <w:p>
-      <w:pPr>
-        <w:rPr>
-          <w:b/>
-          <w:bCs/>
-        </w:rPr>
-      </w:pPr>
-      <w:r>
-        <w:rPr>
-          <w:b/>
-          <w:bCs/>
-        </w:rPr>
-        <w:t>Tools/Software Used</w:t>
-      </w:r>
-    </w:p>
-    <w:p>
-      <w:pPr>
-        <w:numPr>
-          <w:ilvl w:val="0"/>
-          <w:numId w:val="8"/>
-        </w:numPr>
-      </w:pPr>
-      <w:r>
-        <w:rPr>
-          <w:b/>
-          <w:bCs/>
-        </w:rPr>
-        <w:t>GitHub Projects</w:t>
-      </w:r>
-      <w:r>
-        <w:t> - Project planning and tracking</w:t>
-      </w:r>
-    </w:p>
-    <w:p>
-      <w:pPr>
-        <w:numPr>
-          <w:ilvl w:val="0"/>
-          <w:numId w:val="8"/>
-        </w:numPr>
-      </w:pPr>
-      <w:r>
-        <w:rPr>
-          <w:b/>
-          <w:bCs/>
-        </w:rPr>
-        <w:t>User Flow Diagrams</w:t>
-      </w:r>
-      <w:r>
-        <w:t> - Visualizing user journeys</w:t>
-      </w:r>
-    </w:p>
-    <w:p>
-      <w:pPr>
-        <w:numPr>
-          <w:ilvl w:val="0"/>
-          <w:numId w:val="8"/>
-        </w:numPr>
-      </w:pPr>
-      <w:r>
-        <w:rPr>
-          <w:b/>
-          <w:bCs/>
-        </w:rPr>
-        <w:t>Requirements Analysis</w:t>
-      </w:r>
-      <w:r>
-        <w:t> - Functional and non-functional requirements</w:t>
-      </w:r>
-    </w:p>
-    <w:p>
-      <w:pPr>
-        <w:numPr>
-          <w:ilvl w:val="0"/>
-          <w:numId w:val="8"/>
-        </w:numPr>
-      </w:pPr>
-      <w:r>
-        <w:rPr>
-          <w:b/>
-          <w:bCs/>
-        </w:rPr>
-        <w:t>Milestone Planning</w:t>
-      </w:r>
-      <w:r>
-        <w:t> - Development phases and deadlines</w:t>
-      </w:r>
-    </w:p>
-    <w:p>
-      <w:pPr>
-        <w:numPr>
-          <w:ilvl w:val="0"/>
-          <w:numId w:val="8"/>
-        </w:numPr>
-      </w:pPr>
-      <w:r>
-        <w:rPr>
-          <w:b/>
-          <w:bCs/>
-        </w:rPr>
-        <w:t>Git</w:t>
-      </w:r>
-      <w:r>
-        <w:t> - Version control strategy</w:t>
-      </w:r>
-    </w:p>
-    <w:p>
-      <w:pPr>
-        <w:numPr>
-          <w:ilvl w:val="0"/>
-          <w:numId w:val="8"/>
-        </w:numPr>
-      </w:pPr>
-      <w:r>
-        <w:rPr>
-          <w:b/>
-          <w:bCs/>
-        </w:rPr>
-        <w:t>Issue Tracking</w:t>
-      </w:r>
-      <w:r>
-        <w:t> - Task management</w:t>
-      </w:r>
-    </w:p>
-    <w:p>
-      <w:pPr>
-        <w:rPr>
-          <w:b/>
-          <w:bCs/>
-        </w:rPr>
-      </w:pPr>
-      <w:r>
-        <w:rPr>
-          <w:b/>
-          <w:bCs/>
-        </w:rPr>
-        <w:t>Personal Reflection</w:t>
-      </w:r>
-    </w:p>
-    <w:p>
-      <w:r>
-        <w:t>Project planning is essential for successful app development. I learned how to define clear project objectives, outline functional requirements, and plan development milestones. Breaking down the bus booking app into manageable phases helped organize the work effectively. The user flow diagrams provided clarity on how users would interact with the app. Understanding the importance of planning before coding was a valuable lesson. The semester project structure with weekly deliverables gave a structured approach to development.</w:t>
-      </w:r>
-    </w:p>
     <w:p/>
     <w:sectPr>
-      <w:footerReference w:type="default" r:id="rId28"/>
+      <w:footerReference w:type="default" r:id="rId26"/>
       <w:pgSz w:w="12240" w:h="15840"/>
       <w:pgMar w:top="1440" w:right="1440" w:bottom="1440" w:left="1440" w:header="720" w:footer="720" w:gutter="0"/>
       <w:cols w:space="720"/>
@@ -6437,7 +5979,7 @@
 </file>
 
 <file path=customXml/itemProps1.xml><?xml version="1.0" encoding="utf-8"?>
-<ds:datastoreItem xmlns:ds="http://schemas.openxmlformats.org/officeDocument/2006/customXml" ds:itemID="{9B107777-CDB3-47CF-B454-6DAED5BCBF31}">
+<ds:datastoreItem xmlns:ds="http://schemas.openxmlformats.org/officeDocument/2006/customXml" ds:itemID="{5A9ACBEF-5E56-4909-8946-0E12F5814C9D}">
   <ds:schemaRefs>
     <ds:schemaRef ds:uri="http://schemas.openxmlformats.org/officeDocument/2006/bibliography"/>
   </ds:schemaRefs>

</xml_diff>